<commit_message>
Atualiza modelo LAUDO.docx com centralização das células
</commit_message>
<xml_diff>
--- a/docs/modelo_laudo/MODELO - LAUDO.docx
+++ b/docs/modelo_laudo/MODELO - LAUDO.docx
@@ -27,6 +27,7 @@
     </w:p>
     <w:p>
       <w:pPr>
+        <w:jc w:val="center"/>
         <w:rPr>
           <w:b/>
           <w:bCs/>
@@ -35,6 +36,23 @@
     </w:p>
     <w:p>
       <w:pPr>
+        <w:jc w:val="center"/>
+        <w:rPr>
+          <w:b/>
+          <w:bCs/>
+        </w:rPr>
+      </w:pPr>
+      <w:r>
+        <w:rPr>
+          <w:b/>
+          <w:bCs/>
+        </w:rPr>
+        <w:t>FICHA DE INSPEÇÃO VEICULAR (FIV)</w:t>
+      </w:r>
+    </w:p>
+    <w:p>
+      <w:pPr>
+        <w:jc w:val="center"/>
         <w:rPr>
           <w:b/>
           <w:bCs/>
@@ -58,19 +76,12 @@
           <w:bCs/>
         </w:rPr>
       </w:pPr>
-      <w:r>
-        <w:rPr>
-          <w:b/>
-          <w:bCs/>
-        </w:rPr>
-        <w:t>FICHA DE INSPEÇÃO VEICULAR (FIV)</w:t>
-      </w:r>
     </w:p>
     <w:tbl>
       <w:tblPr>
         <w:tblStyle w:val="TableNormal1"/>
-        <w:tblpPr w:leftFromText="141" w:rightFromText="141" w:vertAnchor="text" w:horzAnchor="margin" w:tblpXSpec="center" w:tblpY="868"/>
         <w:tblW w:w="11332" w:type="dxa"/>
+        <w:jc w:val="center"/>
         <w:tblBorders>
           <w:top w:val="single" w:sz="4" w:space="0" w:color="000000"/>
           <w:left w:val="single" w:sz="4" w:space="0" w:color="000000"/>
@@ -88,10 +99,11 @@
         <w:gridCol w:w="563"/>
         <w:gridCol w:w="432"/>
         <w:gridCol w:w="724"/>
-        <w:gridCol w:w="398"/>
+        <w:gridCol w:w="36"/>
+        <w:gridCol w:w="362"/>
         <w:gridCol w:w="306"/>
-        <w:gridCol w:w="112"/>
-        <w:gridCol w:w="176"/>
+        <w:gridCol w:w="93"/>
+        <w:gridCol w:w="195"/>
         <w:gridCol w:w="282"/>
         <w:gridCol w:w="36"/>
         <w:gridCol w:w="248"/>
@@ -117,7 +129,7 @@
       </w:tblGrid>
       <w:tr>
         <w:trPr>
-          <w:trHeight w:val="446"/>
+          <w:jc w:val="center"/>
         </w:trPr>
         <w:tc>
           <w:tcPr>
@@ -168,7 +180,7 @@
         <w:tc>
           <w:tcPr>
             <w:tcW w:w="9087" w:type="dxa"/>
-            <w:gridSpan w:val="27"/>
+            <w:gridSpan w:val="28"/>
             <w:tcBorders>
               <w:left w:val="single" w:sz="4" w:space="0" w:color="D2D2D2"/>
               <w:right w:val="single" w:sz="6" w:space="0" w:color="0000D0"/>
@@ -189,12 +201,12 @@
       </w:tr>
       <w:tr>
         <w:trPr>
-          <w:trHeight w:val="396"/>
+          <w:jc w:val="center"/>
         </w:trPr>
         <w:tc>
           <w:tcPr>
             <w:tcW w:w="7015" w:type="dxa"/>
-            <w:gridSpan w:val="20"/>
+            <w:gridSpan w:val="21"/>
             <w:tcBorders>
               <w:left w:val="single" w:sz="6" w:space="0" w:color="0000D0"/>
             </w:tcBorders>
@@ -322,12 +334,12 @@
       </w:tr>
       <w:tr>
         <w:trPr>
-          <w:trHeight w:val="558"/>
+          <w:jc w:val="center"/>
         </w:trPr>
         <w:tc>
           <w:tcPr>
             <w:tcW w:w="4767" w:type="dxa"/>
-            <w:gridSpan w:val="13"/>
+            <w:gridSpan w:val="14"/>
             <w:tcBorders>
               <w:left w:val="single" w:sz="6" w:space="0" w:color="0000D0"/>
             </w:tcBorders>
@@ -469,7 +481,7 @@
       </w:tr>
       <w:tr>
         <w:trPr>
-          <w:trHeight w:val="338"/>
+          <w:jc w:val="center"/>
         </w:trPr>
         <w:tc>
           <w:tcPr>
@@ -513,7 +525,7 @@
         <w:tc>
           <w:tcPr>
             <w:tcW w:w="2522" w:type="dxa"/>
-            <w:gridSpan w:val="9"/>
+            <w:gridSpan w:val="10"/>
           </w:tcPr>
           <w:p>
             <w:pPr>
@@ -674,12 +686,12 @@
       </w:tr>
       <w:tr>
         <w:trPr>
-          <w:trHeight w:val="290"/>
+          <w:jc w:val="center"/>
         </w:trPr>
         <w:tc>
           <w:tcPr>
             <w:tcW w:w="4279" w:type="dxa"/>
-            <w:gridSpan w:val="11"/>
+            <w:gridSpan w:val="12"/>
             <w:tcBorders>
               <w:left w:val="single" w:sz="6" w:space="0" w:color="0000D0"/>
             </w:tcBorders>
@@ -873,7 +885,7 @@
       </w:tr>
       <w:tr>
         <w:trPr>
-          <w:trHeight w:val="270"/>
+          <w:jc w:val="center"/>
         </w:trPr>
         <w:tc>
           <w:tcPr>
@@ -935,7 +947,7 @@
         <w:tc>
           <w:tcPr>
             <w:tcW w:w="1310" w:type="dxa"/>
-            <w:gridSpan w:val="6"/>
+            <w:gridSpan w:val="7"/>
             <w:vMerge w:val="restart"/>
           </w:tcPr>
           <w:p>
@@ -980,19 +992,22 @@
           <w:tcPr>
             <w:tcW w:w="248" w:type="dxa"/>
             <w:vMerge w:val="restart"/>
-          </w:tcPr>
-          <w:p>
-            <w:pPr>
-              <w:pStyle w:val="TableParagraph"/>
-              <w:rPr>
-                <w:sz w:val="14"/>
-                <w:szCs w:val="14"/>
-              </w:rPr>
-            </w:pPr>
-          </w:p>
-          <w:p>
-            <w:pPr>
-              <w:pStyle w:val="TableParagraph"/>
+            <w:vAlign w:val="center"/>
+          </w:tcPr>
+          <w:p>
+            <w:pPr>
+              <w:pStyle w:val="TableParagraph"/>
+              <w:jc w:val="center"/>
+              <w:rPr>
+                <w:sz w:val="14"/>
+                <w:szCs w:val="14"/>
+              </w:rPr>
+            </w:pPr>
+          </w:p>
+          <w:p>
+            <w:pPr>
+              <w:pStyle w:val="TableParagraph"/>
+              <w:jc w:val="center"/>
               <w:rPr>
                 <w:sz w:val="14"/>
                 <w:szCs w:val="14"/>
@@ -1038,11 +1053,13 @@
           <w:tcPr>
             <w:tcW w:w="353" w:type="dxa"/>
             <w:vMerge w:val="restart"/>
+            <w:vAlign w:val="center"/>
           </w:tcPr>
           <w:p>
             <w:pPr>
               <w:pStyle w:val="TableParagraph"/>
               <w:spacing w:before="120"/>
+              <w:jc w:val="center"/>
               <w:rPr>
                 <w:sz w:val="14"/>
                 <w:szCs w:val="14"/>
@@ -1053,6 +1070,7 @@
             <w:pPr>
               <w:pStyle w:val="TableParagraph"/>
               <w:spacing w:before="120"/>
+              <w:jc w:val="center"/>
               <w:rPr>
                 <w:sz w:val="14"/>
                 <w:szCs w:val="14"/>
@@ -1097,11 +1115,13 @@
           <w:tcPr>
             <w:tcW w:w="212" w:type="dxa"/>
             <w:vMerge w:val="restart"/>
+            <w:vAlign w:val="center"/>
           </w:tcPr>
           <w:p>
             <w:pPr>
               <w:pStyle w:val="TableParagraph"/>
               <w:spacing w:before="120"/>
+              <w:jc w:val="center"/>
               <w:rPr>
                 <w:sz w:val="24"/>
                 <w:szCs w:val="24"/>
@@ -1133,19 +1153,13 @@
             <w:pPr>
               <w:pStyle w:val="TableParagraph"/>
               <w:spacing w:before="120"/>
-              <w:rPr>
-                <w:b/>
-                <w:sz w:val="14"/>
-                <w:szCs w:val="14"/>
-              </w:rPr>
-            </w:pPr>
-            <w:r>
-              <w:rPr>
-                <w:sz w:val="24"/>
-                <w:szCs w:val="24"/>
-              </w:rPr>
-              <w:t xml:space="preserve"> </w:t>
-            </w:r>
+              <w:jc w:val="center"/>
+              <w:rPr>
+                <w:b/>
+                <w:sz w:val="14"/>
+                <w:szCs w:val="14"/>
+              </w:rPr>
+            </w:pPr>
           </w:p>
         </w:tc>
         <w:tc>
@@ -1179,11 +1193,13 @@
           <w:tcPr>
             <w:tcW w:w="316" w:type="dxa"/>
             <w:vMerge w:val="restart"/>
+            <w:vAlign w:val="center"/>
           </w:tcPr>
           <w:p>
             <w:pPr>
               <w:pStyle w:val="TableParagraph"/>
               <w:spacing w:before="120"/>
+              <w:jc w:val="center"/>
               <w:rPr>
                 <w:sz w:val="14"/>
                 <w:szCs w:val="14"/>
@@ -1194,6 +1210,7 @@
             <w:pPr>
               <w:pStyle w:val="TableParagraph"/>
               <w:spacing w:before="120"/>
+              <w:jc w:val="center"/>
               <w:rPr>
                 <w:sz w:val="14"/>
                 <w:szCs w:val="14"/>
@@ -1354,7 +1371,7 @@
       </w:tr>
       <w:tr>
         <w:trPr>
-          <w:trHeight w:val="609"/>
+          <w:jc w:val="center"/>
         </w:trPr>
         <w:tc>
           <w:tcPr>
@@ -1404,7 +1421,7 @@
         <w:tc>
           <w:tcPr>
             <w:tcW w:w="1310" w:type="dxa"/>
-            <w:gridSpan w:val="6"/>
+            <w:gridSpan w:val="7"/>
             <w:vMerge/>
             <w:tcBorders>
               <w:bottom w:val="single" w:sz="6" w:space="0" w:color="000000"/>
@@ -1683,7 +1700,7 @@
       </w:tr>
       <w:tr>
         <w:trPr>
-          <w:trHeight w:val="325"/>
+          <w:jc w:val="center"/>
         </w:trPr>
         <w:tc>
           <w:tcPr>
@@ -1707,6 +1724,7 @@
         <w:tc>
           <w:tcPr>
             <w:tcW w:w="398" w:type="dxa"/>
+            <w:gridSpan w:val="2"/>
             <w:tcBorders>
               <w:top w:val="single" w:sz="6" w:space="0" w:color="000000"/>
             </w:tcBorders>
@@ -1741,7 +1759,7 @@
             <w:pPr>
               <w:pStyle w:val="TableParagraph"/>
               <w:spacing w:line="148" w:lineRule="exact"/>
-              <w:ind w:left="84"/>
+              <w:jc w:val="center"/>
               <w:rPr>
                 <w:b/>
                 <w:sz w:val="13"/>
@@ -1988,7 +2006,7 @@
       </w:tr>
       <w:tr>
         <w:trPr>
-          <w:trHeight w:val="328"/>
+          <w:jc w:val="center"/>
         </w:trPr>
         <w:tc>
           <w:tcPr>
@@ -1997,12 +2015,13 @@
               <w:left w:val="single" w:sz="6" w:space="0" w:color="0000D0"/>
               <w:bottom w:val="single" w:sz="4" w:space="0" w:color="D2D2D2"/>
             </w:tcBorders>
+            <w:vAlign w:val="center"/>
           </w:tcPr>
           <w:p>
             <w:pPr>
               <w:pStyle w:val="TableParagraph"/>
               <w:spacing w:line="148" w:lineRule="exact"/>
-              <w:ind w:left="177"/>
+              <w:jc w:val="center"/>
               <w:rPr>
                 <w:b/>
                 <w:sz w:val="13"/>
@@ -2060,12 +2079,22 @@
         <w:tc>
           <w:tcPr>
             <w:tcW w:w="398" w:type="dxa"/>
-          </w:tcPr>
-          <w:p>
-            <w:pPr>
-              <w:pStyle w:val="TableParagraph"/>
-              <w:spacing w:line="268" w:lineRule="exact"/>
-              <w:ind w:left="103"/>
+            <w:gridSpan w:val="2"/>
+            <w:vAlign w:val="center"/>
+          </w:tcPr>
+          <w:p>
+            <w:pPr>
+              <w:pStyle w:val="TableParagraph"/>
+              <w:jc w:val="center"/>
+              <w:rPr>
+                <w:sz w:val="14"/>
+                <w:szCs w:val="14"/>
+              </w:rPr>
+            </w:pPr>
+          </w:p>
+          <w:p>
+            <w:pPr>
+              <w:pStyle w:val="TableParagraph"/>
               <w:jc w:val="center"/>
               <w:rPr>
                 <w:sz w:val="14"/>
@@ -2084,7 +2113,18 @@
         <w:tc>
           <w:tcPr>
             <w:tcW w:w="306" w:type="dxa"/>
-          </w:tcPr>
+            <w:vAlign w:val="center"/>
+          </w:tcPr>
+          <w:p>
+            <w:pPr>
+              <w:pStyle w:val="TableParagraph"/>
+              <w:jc w:val="center"/>
+              <w:rPr>
+                <w:sz w:val="14"/>
+                <w:szCs w:val="14"/>
+              </w:rPr>
+            </w:pPr>
+          </w:p>
           <w:p>
             <w:pPr>
               <w:pStyle w:val="TableParagraph"/>
@@ -2107,7 +2147,18 @@
           <w:tcPr>
             <w:tcW w:w="288" w:type="dxa"/>
             <w:gridSpan w:val="2"/>
-          </w:tcPr>
+            <w:vAlign w:val="center"/>
+          </w:tcPr>
+          <w:p>
+            <w:pPr>
+              <w:pStyle w:val="TableParagraph"/>
+              <w:jc w:val="center"/>
+              <w:rPr>
+                <w:sz w:val="14"/>
+                <w:szCs w:val="14"/>
+              </w:rPr>
+            </w:pPr>
+          </w:p>
           <w:p>
             <w:pPr>
               <w:pStyle w:val="TableParagraph"/>
@@ -2132,6 +2183,7 @@
             <w:tcBorders>
               <w:bottom w:val="single" w:sz="4" w:space="0" w:color="D2D2D2"/>
             </w:tcBorders>
+            <w:vAlign w:val="center"/>
           </w:tcPr>
           <w:p>
             <w:pPr>
@@ -2149,7 +2201,7 @@
                 <w:b/>
                 <w:sz w:val="13"/>
               </w:rPr>
-              <w:t xml:space="preserve"> 5</w:t>
+              <w:t>5</w:t>
             </w:r>
           </w:p>
         </w:tc>
@@ -2181,12 +2233,21 @@
           <w:tcPr>
             <w:tcW w:w="389" w:type="dxa"/>
             <w:gridSpan w:val="3"/>
-          </w:tcPr>
-          <w:p>
-            <w:pPr>
-              <w:pStyle w:val="TableParagraph"/>
-              <w:spacing w:line="268" w:lineRule="exact"/>
-              <w:ind w:left="51"/>
+            <w:vAlign w:val="center"/>
+          </w:tcPr>
+          <w:p>
+            <w:pPr>
+              <w:pStyle w:val="TableParagraph"/>
+              <w:jc w:val="center"/>
+              <w:rPr>
+                <w:sz w:val="14"/>
+                <w:szCs w:val="14"/>
+              </w:rPr>
+            </w:pPr>
+          </w:p>
+          <w:p>
+            <w:pPr>
+              <w:pStyle w:val="TableParagraph"/>
               <w:jc w:val="center"/>
               <w:rPr>
                 <w:sz w:val="14"/>
@@ -2206,7 +2267,18 @@
           <w:tcPr>
             <w:tcW w:w="327" w:type="dxa"/>
             <w:gridSpan w:val="2"/>
-          </w:tcPr>
+            <w:vAlign w:val="center"/>
+          </w:tcPr>
+          <w:p>
+            <w:pPr>
+              <w:pStyle w:val="TableParagraph"/>
+              <w:jc w:val="center"/>
+              <w:rPr>
+                <w:sz w:val="14"/>
+                <w:szCs w:val="14"/>
+              </w:rPr>
+            </w:pPr>
+          </w:p>
           <w:p>
             <w:pPr>
               <w:pStyle w:val="TableParagraph"/>
@@ -2228,7 +2300,18 @@
         <w:tc>
           <w:tcPr>
             <w:tcW w:w="382" w:type="dxa"/>
-          </w:tcPr>
+            <w:vAlign w:val="center"/>
+          </w:tcPr>
+          <w:p>
+            <w:pPr>
+              <w:pStyle w:val="TableParagraph"/>
+              <w:jc w:val="center"/>
+              <w:rPr>
+                <w:sz w:val="14"/>
+                <w:szCs w:val="14"/>
+              </w:rPr>
+            </w:pPr>
+          </w:p>
           <w:p>
             <w:pPr>
               <w:pStyle w:val="TableParagraph"/>
@@ -2253,6 +2336,7 @@
             <w:tcBorders>
               <w:bottom w:val="single" w:sz="4" w:space="0" w:color="D2D2D2"/>
             </w:tcBorders>
+            <w:vAlign w:val="center"/>
           </w:tcPr>
           <w:p>
             <w:pPr>
@@ -2302,7 +2386,18 @@
         <w:tc>
           <w:tcPr>
             <w:tcW w:w="425" w:type="dxa"/>
-          </w:tcPr>
+            <w:vAlign w:val="center"/>
+          </w:tcPr>
+          <w:p>
+            <w:pPr>
+              <w:pStyle w:val="TableParagraph"/>
+              <w:jc w:val="center"/>
+              <w:rPr>
+                <w:sz w:val="14"/>
+                <w:szCs w:val="14"/>
+              </w:rPr>
+            </w:pPr>
+          </w:p>
           <w:p>
             <w:pPr>
               <w:pStyle w:val="TableParagraph"/>
@@ -2327,11 +2422,11 @@
             <w:tcBorders>
               <w:right w:val="single" w:sz="4" w:space="0" w:color="auto"/>
             </w:tcBorders>
-          </w:tcPr>
-          <w:p>
-            <w:pPr>
-              <w:pStyle w:val="TableParagraph"/>
-              <w:spacing w:line="268" w:lineRule="exact"/>
+            <w:vAlign w:val="center"/>
+          </w:tcPr>
+          <w:p>
+            <w:pPr>
+              <w:pStyle w:val="TableParagraph"/>
               <w:ind w:right="35"/>
               <w:jc w:val="center"/>
               <w:rPr>
@@ -2339,6 +2434,17 @@
                 <w:szCs w:val="14"/>
               </w:rPr>
             </w:pPr>
+          </w:p>
+          <w:p>
+            <w:pPr>
+              <w:pStyle w:val="TableParagraph"/>
+              <w:ind w:right="35"/>
+              <w:jc w:val="center"/>
+              <w:rPr>
+                <w:sz w:val="14"/>
+                <w:szCs w:val="14"/>
+              </w:rPr>
+            </w:pPr>
             <w:r>
               <w:rPr>
                 <w:sz w:val="14"/>
@@ -2354,11 +2460,22 @@
             <w:tcBorders>
               <w:left w:val="single" w:sz="4" w:space="0" w:color="auto"/>
             </w:tcBorders>
-          </w:tcPr>
-          <w:p>
-            <w:pPr>
-              <w:pStyle w:val="TableParagraph"/>
-              <w:spacing w:line="268" w:lineRule="exact"/>
+            <w:vAlign w:val="center"/>
+          </w:tcPr>
+          <w:p>
+            <w:pPr>
+              <w:pStyle w:val="TableParagraph"/>
+              <w:ind w:right="35"/>
+              <w:jc w:val="center"/>
+              <w:rPr>
+                <w:sz w:val="14"/>
+                <w:szCs w:val="14"/>
+              </w:rPr>
+            </w:pPr>
+          </w:p>
+          <w:p>
+            <w:pPr>
+              <w:pStyle w:val="TableParagraph"/>
               <w:ind w:right="35"/>
               <w:jc w:val="center"/>
               <w:rPr>
@@ -2378,7 +2495,7 @@
       </w:tr>
       <w:tr>
         <w:trPr>
-          <w:trHeight w:val="225"/>
+          <w:jc w:val="center"/>
         </w:trPr>
         <w:tc>
           <w:tcPr>
@@ -2388,6 +2505,7 @@
               <w:left w:val="single" w:sz="6" w:space="0" w:color="0000D0"/>
               <w:bottom w:val="single" w:sz="4" w:space="0" w:color="D2D2D2"/>
             </w:tcBorders>
+            <w:vAlign w:val="center"/>
           </w:tcPr>
           <w:p>
             <w:pPr>
@@ -2451,12 +2569,22 @@
         <w:tc>
           <w:tcPr>
             <w:tcW w:w="398" w:type="dxa"/>
-          </w:tcPr>
-          <w:p>
-            <w:pPr>
-              <w:pStyle w:val="TableParagraph"/>
-              <w:spacing w:line="268" w:lineRule="exact"/>
-              <w:ind w:left="103"/>
+            <w:gridSpan w:val="2"/>
+            <w:vAlign w:val="center"/>
+          </w:tcPr>
+          <w:p>
+            <w:pPr>
+              <w:pStyle w:val="TableParagraph"/>
+              <w:jc w:val="center"/>
+              <w:rPr>
+                <w:sz w:val="14"/>
+                <w:szCs w:val="14"/>
+              </w:rPr>
+            </w:pPr>
+          </w:p>
+          <w:p>
+            <w:pPr>
+              <w:pStyle w:val="TableParagraph"/>
               <w:jc w:val="center"/>
               <w:rPr>
                 <w:sz w:val="14"/>
@@ -2475,7 +2603,18 @@
         <w:tc>
           <w:tcPr>
             <w:tcW w:w="306" w:type="dxa"/>
-          </w:tcPr>
+            <w:vAlign w:val="center"/>
+          </w:tcPr>
+          <w:p>
+            <w:pPr>
+              <w:pStyle w:val="TableParagraph"/>
+              <w:jc w:val="center"/>
+              <w:rPr>
+                <w:sz w:val="14"/>
+                <w:szCs w:val="14"/>
+              </w:rPr>
+            </w:pPr>
+          </w:p>
           <w:p>
             <w:pPr>
               <w:pStyle w:val="TableParagraph"/>
@@ -2498,7 +2637,18 @@
           <w:tcPr>
             <w:tcW w:w="288" w:type="dxa"/>
             <w:gridSpan w:val="2"/>
-          </w:tcPr>
+            <w:vAlign w:val="center"/>
+          </w:tcPr>
+          <w:p>
+            <w:pPr>
+              <w:pStyle w:val="TableParagraph"/>
+              <w:jc w:val="center"/>
+              <w:rPr>
+                <w:sz w:val="14"/>
+                <w:szCs w:val="14"/>
+              </w:rPr>
+            </w:pPr>
+          </w:p>
           <w:p>
             <w:pPr>
               <w:pStyle w:val="TableParagraph"/>
@@ -2524,6 +2674,7 @@
               <w:top w:val="single" w:sz="4" w:space="0" w:color="D2D2D2"/>
               <w:bottom w:val="single" w:sz="4" w:space="0" w:color="D2D2D2"/>
             </w:tcBorders>
+            <w:vAlign w:val="center"/>
           </w:tcPr>
           <w:p>
             <w:pPr>
@@ -2580,12 +2731,21 @@
           <w:tcPr>
             <w:tcW w:w="389" w:type="dxa"/>
             <w:gridSpan w:val="3"/>
-          </w:tcPr>
-          <w:p>
-            <w:pPr>
-              <w:pStyle w:val="TableParagraph"/>
-              <w:spacing w:line="268" w:lineRule="exact"/>
-              <w:ind w:left="34"/>
+            <w:vAlign w:val="center"/>
+          </w:tcPr>
+          <w:p>
+            <w:pPr>
+              <w:pStyle w:val="TableParagraph"/>
+              <w:jc w:val="center"/>
+              <w:rPr>
+                <w:sz w:val="14"/>
+                <w:szCs w:val="14"/>
+              </w:rPr>
+            </w:pPr>
+          </w:p>
+          <w:p>
+            <w:pPr>
+              <w:pStyle w:val="TableParagraph"/>
               <w:jc w:val="center"/>
               <w:rPr>
                 <w:sz w:val="14"/>
@@ -2605,7 +2765,18 @@
           <w:tcPr>
             <w:tcW w:w="327" w:type="dxa"/>
             <w:gridSpan w:val="2"/>
-          </w:tcPr>
+            <w:vAlign w:val="center"/>
+          </w:tcPr>
+          <w:p>
+            <w:pPr>
+              <w:pStyle w:val="TableParagraph"/>
+              <w:jc w:val="center"/>
+              <w:rPr>
+                <w:sz w:val="14"/>
+                <w:szCs w:val="14"/>
+              </w:rPr>
+            </w:pPr>
+          </w:p>
           <w:p>
             <w:pPr>
               <w:pStyle w:val="TableParagraph"/>
@@ -2627,7 +2798,18 @@
         <w:tc>
           <w:tcPr>
             <w:tcW w:w="382" w:type="dxa"/>
-          </w:tcPr>
+            <w:vAlign w:val="center"/>
+          </w:tcPr>
+          <w:p>
+            <w:pPr>
+              <w:pStyle w:val="TableParagraph"/>
+              <w:jc w:val="center"/>
+              <w:rPr>
+                <w:sz w:val="14"/>
+                <w:szCs w:val="14"/>
+              </w:rPr>
+            </w:pPr>
+          </w:p>
           <w:p>
             <w:pPr>
               <w:pStyle w:val="TableParagraph"/>
@@ -2653,6 +2835,7 @@
               <w:top w:val="single" w:sz="4" w:space="0" w:color="D2D2D2"/>
               <w:bottom w:val="single" w:sz="4" w:space="0" w:color="D2D2D2"/>
             </w:tcBorders>
+            <w:vAlign w:val="center"/>
           </w:tcPr>
           <w:p>
             <w:pPr>
@@ -2753,7 +2936,18 @@
         <w:tc>
           <w:tcPr>
             <w:tcW w:w="425" w:type="dxa"/>
-          </w:tcPr>
+            <w:vAlign w:val="center"/>
+          </w:tcPr>
+          <w:p>
+            <w:pPr>
+              <w:pStyle w:val="TableParagraph"/>
+              <w:jc w:val="center"/>
+              <w:rPr>
+                <w:sz w:val="14"/>
+                <w:szCs w:val="14"/>
+              </w:rPr>
+            </w:pPr>
+          </w:p>
           <w:p>
             <w:pPr>
               <w:pStyle w:val="TableParagraph"/>
@@ -2771,6 +2965,16 @@
               <w:t>{PIA}</w:t>
             </w:r>
           </w:p>
+          <w:p>
+            <w:pPr>
+              <w:pStyle w:val="TableParagraph"/>
+              <w:jc w:val="center"/>
+              <w:rPr>
+                <w:sz w:val="14"/>
+                <w:szCs w:val="14"/>
+              </w:rPr>
+            </w:pPr>
+          </w:p>
         </w:tc>
         <w:tc>
           <w:tcPr>
@@ -2778,11 +2982,11 @@
             <w:tcBorders>
               <w:right w:val="single" w:sz="4" w:space="0" w:color="auto"/>
             </w:tcBorders>
-          </w:tcPr>
-          <w:p>
-            <w:pPr>
-              <w:pStyle w:val="TableParagraph"/>
-              <w:spacing w:line="268" w:lineRule="exact"/>
+            <w:vAlign w:val="center"/>
+          </w:tcPr>
+          <w:p>
+            <w:pPr>
+              <w:pStyle w:val="TableParagraph"/>
               <w:ind w:right="35"/>
               <w:jc w:val="center"/>
               <w:rPr>
@@ -2790,6 +2994,17 @@
                 <w:szCs w:val="14"/>
               </w:rPr>
             </w:pPr>
+          </w:p>
+          <w:p>
+            <w:pPr>
+              <w:pStyle w:val="TableParagraph"/>
+              <w:ind w:right="35"/>
+              <w:jc w:val="center"/>
+              <w:rPr>
+                <w:sz w:val="14"/>
+                <w:szCs w:val="14"/>
+              </w:rPr>
+            </w:pPr>
             <w:r>
               <w:rPr>
                 <w:sz w:val="14"/>
@@ -2805,11 +3020,22 @@
             <w:tcBorders>
               <w:left w:val="single" w:sz="4" w:space="0" w:color="auto"/>
             </w:tcBorders>
-          </w:tcPr>
-          <w:p>
-            <w:pPr>
-              <w:pStyle w:val="TableParagraph"/>
-              <w:spacing w:line="268" w:lineRule="exact"/>
+            <w:vAlign w:val="center"/>
+          </w:tcPr>
+          <w:p>
+            <w:pPr>
+              <w:pStyle w:val="TableParagraph"/>
+              <w:ind w:right="35"/>
+              <w:jc w:val="center"/>
+              <w:rPr>
+                <w:sz w:val="14"/>
+                <w:szCs w:val="14"/>
+              </w:rPr>
+            </w:pPr>
+          </w:p>
+          <w:p>
+            <w:pPr>
+              <w:pStyle w:val="TableParagraph"/>
               <w:ind w:right="35"/>
               <w:jc w:val="center"/>
               <w:rPr>
@@ -2829,7 +3055,7 @@
       </w:tr>
       <w:tr>
         <w:trPr>
-          <w:trHeight w:val="330"/>
+          <w:jc w:val="center"/>
         </w:trPr>
         <w:tc>
           <w:tcPr>
@@ -2839,6 +3065,7 @@
               <w:left w:val="single" w:sz="6" w:space="0" w:color="0000D0"/>
               <w:bottom w:val="single" w:sz="4" w:space="0" w:color="D2D2D2"/>
             </w:tcBorders>
+            <w:vAlign w:val="center"/>
           </w:tcPr>
           <w:p>
             <w:pPr>
@@ -2902,12 +3129,22 @@
         <w:tc>
           <w:tcPr>
             <w:tcW w:w="398" w:type="dxa"/>
-          </w:tcPr>
-          <w:p>
-            <w:pPr>
-              <w:pStyle w:val="TableParagraph"/>
-              <w:spacing w:line="268" w:lineRule="exact"/>
-              <w:ind w:left="103"/>
+            <w:gridSpan w:val="2"/>
+            <w:vAlign w:val="center"/>
+          </w:tcPr>
+          <w:p>
+            <w:pPr>
+              <w:pStyle w:val="TableParagraph"/>
+              <w:jc w:val="center"/>
+              <w:rPr>
+                <w:sz w:val="14"/>
+                <w:szCs w:val="14"/>
+              </w:rPr>
+            </w:pPr>
+          </w:p>
+          <w:p>
+            <w:pPr>
+              <w:pStyle w:val="TableParagraph"/>
               <w:jc w:val="center"/>
               <w:rPr>
                 <w:sz w:val="14"/>
@@ -2926,7 +3163,18 @@
         <w:tc>
           <w:tcPr>
             <w:tcW w:w="306" w:type="dxa"/>
-          </w:tcPr>
+            <w:vAlign w:val="center"/>
+          </w:tcPr>
+          <w:p>
+            <w:pPr>
+              <w:pStyle w:val="TableParagraph"/>
+              <w:jc w:val="center"/>
+              <w:rPr>
+                <w:sz w:val="14"/>
+                <w:szCs w:val="14"/>
+              </w:rPr>
+            </w:pPr>
+          </w:p>
           <w:p>
             <w:pPr>
               <w:pStyle w:val="TableParagraph"/>
@@ -2956,7 +3204,18 @@
           <w:tcPr>
             <w:tcW w:w="288" w:type="dxa"/>
             <w:gridSpan w:val="2"/>
-          </w:tcPr>
+            <w:vAlign w:val="center"/>
+          </w:tcPr>
+          <w:p>
+            <w:pPr>
+              <w:pStyle w:val="TableParagraph"/>
+              <w:jc w:val="center"/>
+              <w:rPr>
+                <w:sz w:val="14"/>
+                <w:szCs w:val="14"/>
+              </w:rPr>
+            </w:pPr>
+          </w:p>
           <w:p>
             <w:pPr>
               <w:pStyle w:val="TableParagraph"/>
@@ -2982,6 +3241,7 @@
               <w:top w:val="single" w:sz="4" w:space="0" w:color="D2D2D2"/>
               <w:bottom w:val="single" w:sz="4" w:space="0" w:color="D2D2D2"/>
             </w:tcBorders>
+            <w:vAlign w:val="center"/>
           </w:tcPr>
           <w:p>
             <w:pPr>
@@ -3024,7 +3284,7 @@
                 <w:b/>
                 <w:sz w:val="12"/>
               </w:rPr>
-              <w:t xml:space="preserve">                               </w:t>
+              <w:t xml:space="preserve">                             </w:t>
             </w:r>
             <w:r>
               <w:rPr>
@@ -3039,11 +3299,22 @@
           <w:tcPr>
             <w:tcW w:w="389" w:type="dxa"/>
             <w:gridSpan w:val="3"/>
-          </w:tcPr>
-          <w:p>
-            <w:pPr>
-              <w:pStyle w:val="TableParagraph"/>
-              <w:spacing w:line="268" w:lineRule="exact"/>
+            <w:vAlign w:val="center"/>
+          </w:tcPr>
+          <w:p>
+            <w:pPr>
+              <w:pStyle w:val="TableParagraph"/>
+              <w:ind w:left="5"/>
+              <w:jc w:val="center"/>
+              <w:rPr>
+                <w:sz w:val="14"/>
+                <w:szCs w:val="14"/>
+              </w:rPr>
+            </w:pPr>
+          </w:p>
+          <w:p>
+            <w:pPr>
+              <w:pStyle w:val="TableParagraph"/>
               <w:ind w:left="5"/>
               <w:jc w:val="center"/>
               <w:rPr>
@@ -3064,6 +3335,7 @@
           <w:tcPr>
             <w:tcW w:w="327" w:type="dxa"/>
             <w:gridSpan w:val="2"/>
+            <w:vAlign w:val="center"/>
           </w:tcPr>
           <w:p>
             <w:pPr>
@@ -3086,6 +3358,7 @@
         <w:tc>
           <w:tcPr>
             <w:tcW w:w="382" w:type="dxa"/>
+            <w:vAlign w:val="center"/>
           </w:tcPr>
           <w:p>
             <w:pPr>
@@ -3112,12 +3385,14 @@
               <w:top w:val="single" w:sz="4" w:space="0" w:color="D2D2D2"/>
               <w:bottom w:val="single" w:sz="4" w:space="0" w:color="D2D2D2"/>
             </w:tcBorders>
+            <w:vAlign w:val="center"/>
           </w:tcPr>
           <w:p>
             <w:pPr>
               <w:pStyle w:val="TableParagraph"/>
               <w:spacing w:line="148" w:lineRule="exact"/>
               <w:ind w:left="44" w:right="60"/>
+              <w:jc w:val="center"/>
               <w:rPr>
                 <w:b/>
                 <w:sz w:val="13"/>
@@ -3159,11 +3434,11 @@
         <w:tc>
           <w:tcPr>
             <w:tcW w:w="425" w:type="dxa"/>
-          </w:tcPr>
-          <w:p>
-            <w:pPr>
-              <w:pStyle w:val="TableParagraph"/>
-              <w:spacing w:line="268" w:lineRule="exact"/>
+            <w:vAlign w:val="center"/>
+          </w:tcPr>
+          <w:p>
+            <w:pPr>
+              <w:pStyle w:val="TableParagraph"/>
               <w:ind w:right="26"/>
               <w:jc w:val="center"/>
               <w:rPr>
@@ -3186,6 +3461,7 @@
             <w:tcBorders>
               <w:right w:val="single" w:sz="4" w:space="0" w:color="auto"/>
             </w:tcBorders>
+            <w:vAlign w:val="center"/>
           </w:tcPr>
           <w:p>
             <w:pPr>
@@ -3211,6 +3487,7 @@
             <w:tcBorders>
               <w:left w:val="single" w:sz="4" w:space="0" w:color="auto"/>
             </w:tcBorders>
+            <w:vAlign w:val="center"/>
           </w:tcPr>
           <w:p>
             <w:pPr>
@@ -3233,7 +3510,7 @@
       </w:tr>
       <w:tr>
         <w:trPr>
-          <w:trHeight w:val="330"/>
+          <w:jc w:val="center"/>
         </w:trPr>
         <w:tc>
           <w:tcPr>
@@ -3243,6 +3520,7 @@
               <w:left w:val="single" w:sz="6" w:space="0" w:color="0000D0"/>
               <w:bottom w:val="single" w:sz="4" w:space="0" w:color="D2D2D2"/>
             </w:tcBorders>
+            <w:vAlign w:val="center"/>
           </w:tcPr>
           <w:p>
             <w:pPr>
@@ -3306,12 +3584,22 @@
         <w:tc>
           <w:tcPr>
             <w:tcW w:w="398" w:type="dxa"/>
-          </w:tcPr>
-          <w:p>
-            <w:pPr>
-              <w:pStyle w:val="TableParagraph"/>
-              <w:spacing w:line="268" w:lineRule="exact"/>
-              <w:ind w:left="103"/>
+            <w:gridSpan w:val="2"/>
+            <w:vAlign w:val="center"/>
+          </w:tcPr>
+          <w:p>
+            <w:pPr>
+              <w:pStyle w:val="TableParagraph"/>
+              <w:jc w:val="center"/>
+              <w:rPr>
+                <w:sz w:val="14"/>
+                <w:szCs w:val="14"/>
+              </w:rPr>
+            </w:pPr>
+          </w:p>
+          <w:p>
+            <w:pPr>
+              <w:pStyle w:val="TableParagraph"/>
               <w:jc w:val="center"/>
               <w:rPr>
                 <w:sz w:val="14"/>
@@ -3330,7 +3618,18 @@
         <w:tc>
           <w:tcPr>
             <w:tcW w:w="306" w:type="dxa"/>
-          </w:tcPr>
+            <w:vAlign w:val="center"/>
+          </w:tcPr>
+          <w:p>
+            <w:pPr>
+              <w:pStyle w:val="TableParagraph"/>
+              <w:jc w:val="center"/>
+              <w:rPr>
+                <w:sz w:val="14"/>
+                <w:szCs w:val="14"/>
+              </w:rPr>
+            </w:pPr>
+          </w:p>
           <w:p>
             <w:pPr>
               <w:pStyle w:val="TableParagraph"/>
@@ -3353,7 +3652,18 @@
           <w:tcPr>
             <w:tcW w:w="288" w:type="dxa"/>
             <w:gridSpan w:val="2"/>
-          </w:tcPr>
+            <w:vAlign w:val="center"/>
+          </w:tcPr>
+          <w:p>
+            <w:pPr>
+              <w:pStyle w:val="TableParagraph"/>
+              <w:jc w:val="center"/>
+              <w:rPr>
+                <w:sz w:val="14"/>
+                <w:szCs w:val="14"/>
+              </w:rPr>
+            </w:pPr>
+          </w:p>
           <w:p>
             <w:pPr>
               <w:pStyle w:val="TableParagraph"/>
@@ -3379,6 +3689,7 @@
               <w:top w:val="single" w:sz="4" w:space="0" w:color="D2D2D2"/>
               <w:bottom w:val="single" w:sz="4" w:space="0" w:color="D2D2D2"/>
             </w:tcBorders>
+            <w:vAlign w:val="center"/>
           </w:tcPr>
           <w:p>
             <w:pPr>
@@ -3436,12 +3747,11 @@
           <w:tcPr>
             <w:tcW w:w="389" w:type="dxa"/>
             <w:gridSpan w:val="3"/>
-          </w:tcPr>
-          <w:p>
-            <w:pPr>
-              <w:pStyle w:val="TableParagraph"/>
-              <w:spacing w:line="268" w:lineRule="exact"/>
-              <w:ind w:left="5"/>
+            <w:vAlign w:val="center"/>
+          </w:tcPr>
+          <w:p>
+            <w:pPr>
+              <w:pStyle w:val="TableParagraph"/>
               <w:jc w:val="center"/>
               <w:rPr>
                 <w:sz w:val="14"/>
@@ -3461,6 +3771,7 @@
           <w:tcPr>
             <w:tcW w:w="327" w:type="dxa"/>
             <w:gridSpan w:val="2"/>
+            <w:vAlign w:val="center"/>
           </w:tcPr>
           <w:p>
             <w:pPr>
@@ -3483,6 +3794,7 @@
         <w:tc>
           <w:tcPr>
             <w:tcW w:w="382" w:type="dxa"/>
+            <w:vAlign w:val="center"/>
           </w:tcPr>
           <w:p>
             <w:pPr>
@@ -3509,6 +3821,7 @@
               <w:top w:val="single" w:sz="4" w:space="0" w:color="D2D2D2"/>
               <w:bottom w:val="single" w:sz="4" w:space="0" w:color="D2D2D2"/>
             </w:tcBorders>
+            <w:vAlign w:val="center"/>
           </w:tcPr>
           <w:p>
             <w:pPr>
@@ -3557,11 +3870,11 @@
         <w:tc>
           <w:tcPr>
             <w:tcW w:w="425" w:type="dxa"/>
-          </w:tcPr>
-          <w:p>
-            <w:pPr>
-              <w:pStyle w:val="TableParagraph"/>
-              <w:spacing w:line="268" w:lineRule="exact"/>
+            <w:vAlign w:val="center"/>
+          </w:tcPr>
+          <w:p>
+            <w:pPr>
+              <w:pStyle w:val="TableParagraph"/>
               <w:ind w:right="26"/>
               <w:jc w:val="center"/>
               <w:rPr>
@@ -3584,6 +3897,7 @@
             <w:tcBorders>
               <w:right w:val="single" w:sz="4" w:space="0" w:color="auto"/>
             </w:tcBorders>
+            <w:vAlign w:val="center"/>
           </w:tcPr>
           <w:p>
             <w:pPr>
@@ -3609,6 +3923,7 @@
             <w:tcBorders>
               <w:left w:val="single" w:sz="4" w:space="0" w:color="auto"/>
             </w:tcBorders>
+            <w:vAlign w:val="center"/>
           </w:tcPr>
           <w:p>
             <w:pPr>
@@ -3631,7 +3946,7 @@
       </w:tr>
       <w:tr>
         <w:trPr>
-          <w:trHeight w:val="285"/>
+          <w:jc w:val="center"/>
         </w:trPr>
         <w:tc>
           <w:tcPr>
@@ -3685,7 +4000,8 @@
         </w:tc>
         <w:tc>
           <w:tcPr>
-            <w:tcW w:w="724" w:type="dxa"/>
+            <w:tcW w:w="760" w:type="dxa"/>
+            <w:gridSpan w:val="2"/>
           </w:tcPr>
           <w:p>
             <w:pPr>
@@ -3708,7 +4024,7 @@
         </w:tc>
         <w:tc>
           <w:tcPr>
-            <w:tcW w:w="816" w:type="dxa"/>
+            <w:tcW w:w="761" w:type="dxa"/>
             <w:gridSpan w:val="3"/>
           </w:tcPr>
           <w:p>
@@ -3732,7 +4048,7 @@
         </w:tc>
         <w:tc>
           <w:tcPr>
-            <w:tcW w:w="742" w:type="dxa"/>
+            <w:tcW w:w="761" w:type="dxa"/>
             <w:gridSpan w:val="4"/>
           </w:tcPr>
           <w:p>
@@ -3848,7 +4164,7 @@
       </w:tr>
       <w:tr>
         <w:trPr>
-          <w:trHeight w:val="311"/>
+          <w:jc w:val="center"/>
         </w:trPr>
         <w:tc>
           <w:tcPr>
@@ -3894,7 +4210,9 @@
         </w:tc>
         <w:tc>
           <w:tcPr>
-            <w:tcW w:w="724" w:type="dxa"/>
+            <w:tcW w:w="760" w:type="dxa"/>
+            <w:gridSpan w:val="2"/>
+            <w:vAlign w:val="center"/>
           </w:tcPr>
           <w:p>
             <w:pPr>
@@ -3914,8 +4232,9 @@
         </w:tc>
         <w:tc>
           <w:tcPr>
-            <w:tcW w:w="816" w:type="dxa"/>
+            <w:tcW w:w="761" w:type="dxa"/>
             <w:gridSpan w:val="3"/>
+            <w:vAlign w:val="center"/>
           </w:tcPr>
           <w:p>
             <w:pPr>
@@ -3930,30 +4249,20 @@
               <w:rPr>
                 <w:sz w:val="14"/>
               </w:rPr>
-              <w:t>{DD</w:t>
-            </w:r>
-            <w:r>
-              <w:rPr>
-                <w:sz w:val="14"/>
-              </w:rPr>
-              <w:t>B</w:t>
-            </w:r>
-            <w:r>
-              <w:rPr>
-                <w:sz w:val="14"/>
-              </w:rPr>
-              <w:t>}</w:t>
-            </w:r>
-          </w:p>
-        </w:tc>
-        <w:tc>
-          <w:tcPr>
-            <w:tcW w:w="742" w:type="dxa"/>
+              <w:t>{DDB}</w:t>
+            </w:r>
+          </w:p>
+        </w:tc>
+        <w:tc>
+          <w:tcPr>
+            <w:tcW w:w="761" w:type="dxa"/>
             <w:gridSpan w:val="4"/>
-          </w:tcPr>
-          <w:p>
-            <w:pPr>
-              <w:pStyle w:val="TableParagraph"/>
+            <w:vAlign w:val="center"/>
+          </w:tcPr>
+          <w:p>
+            <w:pPr>
+              <w:pStyle w:val="TableParagraph"/>
+              <w:jc w:val="center"/>
               <w:rPr>
                 <w:sz w:val="24"/>
               </w:rPr>
@@ -3962,25 +4271,7 @@
               <w:rPr>
                 <w:sz w:val="14"/>
               </w:rPr>
-              <w:t>{</w:t>
-            </w:r>
-            <w:r>
-              <w:rPr>
-                <w:sz w:val="14"/>
-              </w:rPr>
-              <w:t>DD</w:t>
-            </w:r>
-            <w:r>
-              <w:rPr>
-                <w:sz w:val="14"/>
-              </w:rPr>
-              <w:t>R</w:t>
-            </w:r>
-            <w:r>
-              <w:rPr>
-                <w:sz w:val="14"/>
-              </w:rPr>
-              <w:t>}</w:t>
+              <w:t>{DDR}</w:t>
             </w:r>
           </w:p>
         </w:tc>
@@ -4044,6 +4335,7 @@
         <w:tc>
           <w:tcPr>
             <w:tcW w:w="1172" w:type="dxa"/>
+            <w:vAlign w:val="center"/>
           </w:tcPr>
           <w:p>
             <w:pPr>
@@ -4065,6 +4357,7 @@
           <w:tcPr>
             <w:tcW w:w="1275" w:type="dxa"/>
             <w:gridSpan w:val="3"/>
+            <w:vAlign w:val="center"/>
           </w:tcPr>
           <w:p>
             <w:pPr>
@@ -4080,26 +4373,14 @@
               <w:rPr>
                 <w:sz w:val="14"/>
               </w:rPr>
-              <w:t>{</w:t>
-            </w:r>
-            <w:r>
-              <w:rPr>
-                <w:sz w:val="14"/>
-              </w:rPr>
-              <w:t>RDD</w:t>
-            </w:r>
-            <w:r>
-              <w:rPr>
-                <w:sz w:val="14"/>
-              </w:rPr>
-              <w:t>P}</w:t>
+              <w:t>{RDDP}</w:t>
             </w:r>
           </w:p>
         </w:tc>
       </w:tr>
       <w:tr>
         <w:trPr>
-          <w:trHeight w:val="289"/>
+          <w:jc w:val="center"/>
         </w:trPr>
         <w:tc>
           <w:tcPr>
@@ -4145,7 +4426,9 @@
         </w:tc>
         <w:tc>
           <w:tcPr>
-            <w:tcW w:w="724" w:type="dxa"/>
+            <w:tcW w:w="760" w:type="dxa"/>
+            <w:gridSpan w:val="2"/>
+            <w:vAlign w:val="center"/>
           </w:tcPr>
           <w:p>
             <w:pPr>
@@ -4165,63 +4448,45 @@
         </w:tc>
         <w:tc>
           <w:tcPr>
-            <w:tcW w:w="816" w:type="dxa"/>
+            <w:tcW w:w="761" w:type="dxa"/>
             <w:gridSpan w:val="3"/>
-          </w:tcPr>
-          <w:p>
-            <w:pPr>
-              <w:pStyle w:val="TableParagraph"/>
-              <w:jc w:val="center"/>
-              <w:rPr>
-                <w:sz w:val="24"/>
-                <w:szCs w:val="24"/>
-              </w:rPr>
-            </w:pPr>
-            <w:r>
-              <w:rPr>
-                <w:sz w:val="14"/>
-              </w:rPr>
-              <w:t>{DE</w:t>
-            </w:r>
-            <w:r>
-              <w:rPr>
-                <w:sz w:val="14"/>
-              </w:rPr>
-              <w:t>B</w:t>
-            </w:r>
-            <w:r>
-              <w:rPr>
-                <w:sz w:val="14"/>
-              </w:rPr>
-              <w:t>}</w:t>
-            </w:r>
-          </w:p>
-        </w:tc>
-        <w:tc>
-          <w:tcPr>
-            <w:tcW w:w="742" w:type="dxa"/>
+            <w:vAlign w:val="center"/>
+          </w:tcPr>
+          <w:p>
+            <w:pPr>
+              <w:pStyle w:val="TableParagraph"/>
+              <w:jc w:val="center"/>
+              <w:rPr>
+                <w:sz w:val="14"/>
+              </w:rPr>
+            </w:pPr>
+            <w:r>
+              <w:rPr>
+                <w:sz w:val="14"/>
+              </w:rPr>
+              <w:t>{DEB}</w:t>
+            </w:r>
+          </w:p>
+        </w:tc>
+        <w:tc>
+          <w:tcPr>
+            <w:tcW w:w="761" w:type="dxa"/>
             <w:gridSpan w:val="4"/>
-          </w:tcPr>
-          <w:p>
-            <w:pPr>
-              <w:pStyle w:val="TableParagraph"/>
-              <w:ind w:right="288"/>
-              <w:jc w:val="center"/>
-              <w:rPr>
-                <w:sz w:val="24"/>
-              </w:rPr>
-            </w:pPr>
-            <w:r>
-              <w:rPr>
-                <w:sz w:val="14"/>
-              </w:rPr>
-              <w:t>{DE</w:t>
-            </w:r>
-            <w:r>
-              <w:rPr>
-                <w:sz w:val="14"/>
-              </w:rPr>
-              <w:t>R}</w:t>
+            <w:vAlign w:val="center"/>
+          </w:tcPr>
+          <w:p>
+            <w:pPr>
+              <w:pStyle w:val="TableParagraph"/>
+              <w:jc w:val="center"/>
+              <w:rPr>
+                <w:sz w:val="14"/>
+              </w:rPr>
+            </w:pPr>
+            <w:r>
+              <w:rPr>
+                <w:sz w:val="14"/>
+              </w:rPr>
+              <w:t>{DER}</w:t>
             </w:r>
           </w:p>
         </w:tc>
@@ -4229,17 +4494,16 @@
           <w:tcPr>
             <w:tcW w:w="1668" w:type="dxa"/>
             <w:gridSpan w:val="5"/>
-            <w:vMerge w:val="restart"/>
             <w:tcBorders>
               <w:top w:val="nil"/>
-              <w:bottom w:val="single" w:sz="6" w:space="0" w:color="000000"/>
-            </w:tcBorders>
-          </w:tcPr>
-          <w:p>
-            <w:pPr>
-              <w:pStyle w:val="TableParagraph"/>
-              <w:rPr>
-                <w:sz w:val="14"/>
+              <w:bottom w:val="nil"/>
+            </w:tcBorders>
+          </w:tcPr>
+          <w:p>
+            <w:pPr>
+              <w:rPr>
+                <w:sz w:val="2"/>
+                <w:szCs w:val="2"/>
               </w:rPr>
             </w:pPr>
           </w:p>
@@ -4263,28 +4527,14 @@
                 <w:b/>
                 <w:sz w:val="13"/>
               </w:rPr>
-              <w:t>DIANTEIRO</w:t>
-            </w:r>
-            <w:r>
-              <w:rPr>
-                <w:b/>
-                <w:spacing w:val="-2"/>
-                <w:sz w:val="13"/>
-              </w:rPr>
-              <w:t xml:space="preserve"> </w:t>
-            </w:r>
-            <w:r>
-              <w:rPr>
-                <w:b/>
-                <w:sz w:val="13"/>
-              </w:rPr>
-              <w:t>ESQUERDO</w:t>
+              <w:t>DIANTEIRO ESQUERDO</w:t>
             </w:r>
           </w:p>
         </w:tc>
         <w:tc>
           <w:tcPr>
             <w:tcW w:w="1172" w:type="dxa"/>
+            <w:vAlign w:val="center"/>
           </w:tcPr>
           <w:p>
             <w:pPr>
@@ -4306,41 +4556,29 @@
           <w:tcPr>
             <w:tcW w:w="1275" w:type="dxa"/>
             <w:gridSpan w:val="3"/>
-          </w:tcPr>
-          <w:p>
-            <w:pPr>
-              <w:pStyle w:val="TableParagraph"/>
-              <w:spacing w:line="268" w:lineRule="exact"/>
-              <w:jc w:val="center"/>
-              <w:rPr>
-                <w:sz w:val="24"/>
-                <w:szCs w:val="24"/>
-              </w:rPr>
-            </w:pPr>
-            <w:r>
-              <w:rPr>
-                <w:sz w:val="14"/>
-              </w:rPr>
-              <w:t>{RDE</w:t>
-            </w:r>
-            <w:r>
-              <w:rPr>
-                <w:sz w:val="14"/>
-              </w:rPr>
-              <w:t>P</w:t>
-            </w:r>
-            <w:r>
-              <w:rPr>
-                <w:sz w:val="14"/>
-              </w:rPr>
-              <w:t>}</w:t>
+            <w:vAlign w:val="center"/>
+          </w:tcPr>
+          <w:p>
+            <w:pPr>
+              <w:pStyle w:val="TableParagraph"/>
+              <w:ind w:right="25"/>
+              <w:jc w:val="center"/>
+              <w:rPr>
+                <w:sz w:val="14"/>
+              </w:rPr>
+            </w:pPr>
+            <w:r>
+              <w:rPr>
+                <w:sz w:val="14"/>
+              </w:rPr>
+              <w:t>{RDEP}</w:t>
             </w:r>
           </w:p>
         </w:tc>
       </w:tr>
       <w:tr>
         <w:trPr>
-          <w:trHeight w:val="287"/>
+          <w:jc w:val="center"/>
         </w:trPr>
         <w:tc>
           <w:tcPr>
@@ -4365,28 +4603,15 @@
                 <w:b/>
                 <w:sz w:val="13"/>
               </w:rPr>
-              <w:t>TRASEIRO</w:t>
-            </w:r>
-            <w:r>
-              <w:rPr>
-                <w:b/>
-                <w:spacing w:val="-7"/>
-                <w:sz w:val="13"/>
-              </w:rPr>
-              <w:t xml:space="preserve"> </w:t>
-            </w:r>
-            <w:r>
-              <w:rPr>
-                <w:b/>
-                <w:sz w:val="13"/>
-              </w:rPr>
-              <w:t>DIREITO</w:t>
-            </w:r>
-          </w:p>
-        </w:tc>
-        <w:tc>
-          <w:tcPr>
-            <w:tcW w:w="724" w:type="dxa"/>
+              <w:t>TRASEIRO DIREITO</w:t>
+            </w:r>
+          </w:p>
+        </w:tc>
+        <w:tc>
+          <w:tcPr>
+            <w:tcW w:w="760" w:type="dxa"/>
+            <w:gridSpan w:val="2"/>
+            <w:vAlign w:val="center"/>
           </w:tcPr>
           <w:p>
             <w:pPr>
@@ -4406,82 +4631,45 @@
         </w:tc>
         <w:tc>
           <w:tcPr>
-            <w:tcW w:w="816" w:type="dxa"/>
+            <w:tcW w:w="761" w:type="dxa"/>
             <w:gridSpan w:val="3"/>
-          </w:tcPr>
-          <w:p>
-            <w:pPr>
-              <w:pStyle w:val="TableParagraph"/>
-              <w:jc w:val="center"/>
-              <w:rPr>
-                <w:sz w:val="24"/>
-                <w:szCs w:val="24"/>
-              </w:rPr>
-            </w:pPr>
-            <w:r>
-              <w:rPr>
-                <w:sz w:val="14"/>
-              </w:rPr>
-              <w:t>{TD</w:t>
-            </w:r>
-            <w:r>
-              <w:rPr>
-                <w:sz w:val="14"/>
-              </w:rPr>
-              <w:t>B</w:t>
-            </w:r>
-            <w:r>
-              <w:rPr>
-                <w:sz w:val="14"/>
-              </w:rPr>
-              <w:t>}</w:t>
-            </w:r>
-          </w:p>
-        </w:tc>
-        <w:tc>
-          <w:tcPr>
-            <w:tcW w:w="742" w:type="dxa"/>
+            <w:vAlign w:val="center"/>
+          </w:tcPr>
+          <w:p>
+            <w:pPr>
+              <w:pStyle w:val="TableParagraph"/>
+              <w:jc w:val="center"/>
+              <w:rPr>
+                <w:sz w:val="14"/>
+              </w:rPr>
+            </w:pPr>
+            <w:r>
+              <w:rPr>
+                <w:sz w:val="14"/>
+              </w:rPr>
+              <w:t>{TDB}</w:t>
+            </w:r>
+          </w:p>
+        </w:tc>
+        <w:tc>
+          <w:tcPr>
+            <w:tcW w:w="761" w:type="dxa"/>
             <w:gridSpan w:val="4"/>
-          </w:tcPr>
-          <w:p>
-            <w:pPr>
-              <w:pStyle w:val="TableParagraph"/>
-              <w:ind w:right="288"/>
-              <w:rPr>
-                <w:sz w:val="24"/>
-              </w:rPr>
-            </w:pPr>
-            <w:r>
-              <w:rPr>
-                <w:sz w:val="14"/>
-              </w:rPr>
-              <w:t>{</w:t>
-            </w:r>
-            <w:proofErr w:type="gramStart"/>
-            <w:r>
-              <w:rPr>
-                <w:sz w:val="14"/>
-              </w:rPr>
-              <w:t>TDR}</w:t>
-            </w:r>
-            <w:r>
-              <w:rPr>
-                <w:sz w:val="24"/>
-              </w:rPr>
-              <w:t xml:space="preserve">  </w:t>
-            </w:r>
-            <w:r>
-              <w:rPr>
-                <w:sz w:val="24"/>
-              </w:rPr>
-              <w:t xml:space="preserve"> </w:t>
-            </w:r>
-            <w:proofErr w:type="gramEnd"/>
-            <w:r>
-              <w:rPr>
-                <w:sz w:val="24"/>
-              </w:rPr>
-              <w:t xml:space="preserve"> </w:t>
+            <w:vAlign w:val="center"/>
+          </w:tcPr>
+          <w:p>
+            <w:pPr>
+              <w:pStyle w:val="TableParagraph"/>
+              <w:jc w:val="center"/>
+              <w:rPr>
+                <w:sz w:val="14"/>
+              </w:rPr>
+            </w:pPr>
+            <w:r>
+              <w:rPr>
+                <w:sz w:val="14"/>
+              </w:rPr>
+              <w:t>{TDR}</w:t>
             </w:r>
           </w:p>
         </w:tc>
@@ -4489,10 +4677,9 @@
           <w:tcPr>
             <w:tcW w:w="1668" w:type="dxa"/>
             <w:gridSpan w:val="5"/>
-            <w:vMerge/>
             <w:tcBorders>
               <w:top w:val="nil"/>
-              <w:bottom w:val="single" w:sz="6" w:space="0" w:color="000000"/>
+              <w:bottom w:val="nil"/>
             </w:tcBorders>
           </w:tcPr>
           <w:p>
@@ -4523,54 +4710,28 @@
                 <w:b/>
                 <w:sz w:val="13"/>
               </w:rPr>
-              <w:t>TRASEIRO</w:t>
-            </w:r>
-            <w:r>
-              <w:rPr>
-                <w:b/>
-                <w:spacing w:val="-7"/>
-                <w:sz w:val="13"/>
-              </w:rPr>
-              <w:t xml:space="preserve"> </w:t>
-            </w:r>
-            <w:r>
-              <w:rPr>
-                <w:b/>
-                <w:sz w:val="13"/>
-              </w:rPr>
-              <w:t>DIREITO</w:t>
+              <w:t>TRASEIRO DIREITO</w:t>
             </w:r>
           </w:p>
         </w:tc>
         <w:tc>
           <w:tcPr>
             <w:tcW w:w="1172" w:type="dxa"/>
-          </w:tcPr>
-          <w:p>
-            <w:pPr>
-              <w:pStyle w:val="TableParagraph"/>
-              <w:jc w:val="center"/>
-              <w:rPr>
-                <w:sz w:val="14"/>
-              </w:rPr>
-            </w:pPr>
-            <w:r>
-              <w:rPr>
-                <w:sz w:val="14"/>
-              </w:rPr>
-              <w:t>{R</w:t>
-            </w:r>
-            <w:r>
-              <w:rPr>
-                <w:sz w:val="14"/>
-              </w:rPr>
-              <w:t>TD</w:t>
-            </w:r>
-            <w:r>
-              <w:rPr>
-                <w:sz w:val="14"/>
-              </w:rPr>
-              <w:t>F}</w:t>
+            <w:vAlign w:val="center"/>
+          </w:tcPr>
+          <w:p>
+            <w:pPr>
+              <w:pStyle w:val="TableParagraph"/>
+              <w:jc w:val="center"/>
+              <w:rPr>
+                <w:sz w:val="14"/>
+              </w:rPr>
+            </w:pPr>
+            <w:r>
+              <w:rPr>
+                <w:sz w:val="14"/>
+              </w:rPr>
+              <w:t>{RTDF}</w:t>
             </w:r>
           </w:p>
         </w:tc>
@@ -4578,41 +4739,29 @@
           <w:tcPr>
             <w:tcW w:w="1275" w:type="dxa"/>
             <w:gridSpan w:val="3"/>
-          </w:tcPr>
-          <w:p>
-            <w:pPr>
-              <w:pStyle w:val="TableParagraph"/>
-              <w:spacing w:line="263" w:lineRule="exact"/>
-              <w:jc w:val="center"/>
-              <w:rPr>
-                <w:sz w:val="24"/>
-                <w:szCs w:val="24"/>
-              </w:rPr>
-            </w:pPr>
-            <w:r>
-              <w:rPr>
-                <w:sz w:val="14"/>
-              </w:rPr>
-              <w:t>{RTD</w:t>
-            </w:r>
-            <w:r>
-              <w:rPr>
-                <w:sz w:val="14"/>
-              </w:rPr>
-              <w:t>P</w:t>
-            </w:r>
-            <w:r>
-              <w:rPr>
-                <w:sz w:val="14"/>
-              </w:rPr>
-              <w:t>}</w:t>
+            <w:vAlign w:val="center"/>
+          </w:tcPr>
+          <w:p>
+            <w:pPr>
+              <w:pStyle w:val="TableParagraph"/>
+              <w:ind w:right="25"/>
+              <w:jc w:val="center"/>
+              <w:rPr>
+                <w:sz w:val="14"/>
+              </w:rPr>
+            </w:pPr>
+            <w:r>
+              <w:rPr>
+                <w:sz w:val="14"/>
+              </w:rPr>
+              <w:t>{RTDP}</w:t>
             </w:r>
           </w:p>
         </w:tc>
       </w:tr>
       <w:tr>
         <w:trPr>
-          <w:trHeight w:val="287"/>
+          <w:jc w:val="center"/>
         </w:trPr>
         <w:tc>
           <w:tcPr>
@@ -4637,28 +4786,15 @@
                 <w:b/>
                 <w:sz w:val="13"/>
               </w:rPr>
-              <w:t>TRASEIRO</w:t>
-            </w:r>
-            <w:r>
-              <w:rPr>
-                <w:b/>
-                <w:spacing w:val="-6"/>
-                <w:sz w:val="13"/>
-              </w:rPr>
-              <w:t xml:space="preserve"> </w:t>
-            </w:r>
-            <w:r>
-              <w:rPr>
-                <w:b/>
-                <w:sz w:val="13"/>
-              </w:rPr>
-              <w:t>ESQUERDO</w:t>
-            </w:r>
-          </w:p>
-        </w:tc>
-        <w:tc>
-          <w:tcPr>
-            <w:tcW w:w="724" w:type="dxa"/>
+              <w:t>TRASEIRO ESQUERDO</w:t>
+            </w:r>
+          </w:p>
+        </w:tc>
+        <w:tc>
+          <w:tcPr>
+            <w:tcW w:w="760" w:type="dxa"/>
+            <w:gridSpan w:val="2"/>
+            <w:vAlign w:val="center"/>
           </w:tcPr>
           <w:p>
             <w:pPr>
@@ -4678,69 +4814,45 @@
         </w:tc>
         <w:tc>
           <w:tcPr>
-            <w:tcW w:w="816" w:type="dxa"/>
+            <w:tcW w:w="761" w:type="dxa"/>
             <w:gridSpan w:val="3"/>
-          </w:tcPr>
-          <w:p>
-            <w:pPr>
-              <w:pStyle w:val="TableParagraph"/>
-              <w:jc w:val="center"/>
-              <w:rPr>
-                <w:sz w:val="24"/>
-                <w:szCs w:val="24"/>
-              </w:rPr>
-            </w:pPr>
-            <w:r>
-              <w:rPr>
-                <w:sz w:val="14"/>
-              </w:rPr>
-              <w:t>{TE</w:t>
-            </w:r>
-            <w:r>
-              <w:rPr>
-                <w:sz w:val="14"/>
-              </w:rPr>
-              <w:t>B</w:t>
-            </w:r>
-            <w:r>
-              <w:rPr>
-                <w:sz w:val="14"/>
-              </w:rPr>
-              <w:t>}</w:t>
-            </w:r>
-          </w:p>
-        </w:tc>
-        <w:tc>
-          <w:tcPr>
-            <w:tcW w:w="742" w:type="dxa"/>
+            <w:vAlign w:val="center"/>
+          </w:tcPr>
+          <w:p>
+            <w:pPr>
+              <w:pStyle w:val="TableParagraph"/>
+              <w:jc w:val="center"/>
+              <w:rPr>
+                <w:sz w:val="14"/>
+              </w:rPr>
+            </w:pPr>
+            <w:r>
+              <w:rPr>
+                <w:sz w:val="14"/>
+              </w:rPr>
+              <w:t>{TEB}</w:t>
+            </w:r>
+          </w:p>
+        </w:tc>
+        <w:tc>
+          <w:tcPr>
+            <w:tcW w:w="761" w:type="dxa"/>
             <w:gridSpan w:val="4"/>
-          </w:tcPr>
-          <w:p>
-            <w:pPr>
-              <w:pStyle w:val="TableParagraph"/>
-              <w:ind w:right="288"/>
-              <w:jc w:val="center"/>
-              <w:rPr>
-                <w:sz w:val="15"/>
-              </w:rPr>
-            </w:pPr>
-            <w:r>
-              <w:rPr>
-                <w:sz w:val="15"/>
-              </w:rPr>
-              <w:t>{TE</w:t>
-            </w:r>
-            <w:r>
-              <w:rPr>
-                <w:sz w:val="15"/>
-              </w:rPr>
-              <w:t>R</w:t>
-            </w:r>
-            <w:r>
-              <w:rPr>
-                <w:sz w:val="15"/>
-              </w:rPr>
-              <w:t>}</w:t>
+            <w:vAlign w:val="center"/>
+          </w:tcPr>
+          <w:p>
+            <w:pPr>
+              <w:pStyle w:val="TableParagraph"/>
+              <w:jc w:val="center"/>
+              <w:rPr>
+                <w:sz w:val="14"/>
+              </w:rPr>
+            </w:pPr>
+            <w:r>
+              <w:rPr>
+                <w:sz w:val="14"/>
+              </w:rPr>
+              <w:t>{TER}</w:t>
             </w:r>
           </w:p>
         </w:tc>
@@ -4748,10 +4860,9 @@
           <w:tcPr>
             <w:tcW w:w="1668" w:type="dxa"/>
             <w:gridSpan w:val="5"/>
-            <w:vMerge/>
             <w:tcBorders>
               <w:top w:val="nil"/>
-              <w:bottom w:val="single" w:sz="6" w:space="0" w:color="000000"/>
+              <w:bottom w:val="nil"/>
             </w:tcBorders>
           </w:tcPr>
           <w:p>
@@ -4782,54 +4893,28 @@
                 <w:b/>
                 <w:sz w:val="13"/>
               </w:rPr>
-              <w:t>TRASEIRO</w:t>
-            </w:r>
-            <w:r>
-              <w:rPr>
-                <w:b/>
-                <w:spacing w:val="-6"/>
-                <w:sz w:val="13"/>
-              </w:rPr>
-              <w:t xml:space="preserve"> </w:t>
-            </w:r>
-            <w:r>
-              <w:rPr>
-                <w:b/>
-                <w:sz w:val="13"/>
-              </w:rPr>
-              <w:t>ESQUERDO</w:t>
+              <w:t>TRASEIRO ESQUERDO</w:t>
             </w:r>
           </w:p>
         </w:tc>
         <w:tc>
           <w:tcPr>
             <w:tcW w:w="1172" w:type="dxa"/>
-          </w:tcPr>
-          <w:p>
-            <w:pPr>
-              <w:pStyle w:val="TableParagraph"/>
-              <w:jc w:val="center"/>
-              <w:rPr>
-                <w:sz w:val="14"/>
-              </w:rPr>
-            </w:pPr>
-            <w:r>
-              <w:rPr>
-                <w:sz w:val="14"/>
-              </w:rPr>
-              <w:t>{RT</w:t>
-            </w:r>
-            <w:r>
-              <w:rPr>
-                <w:sz w:val="14"/>
-              </w:rPr>
-              <w:t>E</w:t>
-            </w:r>
-            <w:r>
-              <w:rPr>
-                <w:sz w:val="14"/>
-              </w:rPr>
-              <w:t>F}</w:t>
+            <w:vAlign w:val="center"/>
+          </w:tcPr>
+          <w:p>
+            <w:pPr>
+              <w:pStyle w:val="TableParagraph"/>
+              <w:jc w:val="center"/>
+              <w:rPr>
+                <w:sz w:val="14"/>
+              </w:rPr>
+            </w:pPr>
+            <w:r>
+              <w:rPr>
+                <w:sz w:val="14"/>
+              </w:rPr>
+              <w:t>{RTEF}</w:t>
             </w:r>
           </w:p>
         </w:tc>
@@ -4837,43 +4922,31 @@
           <w:tcPr>
             <w:tcW w:w="1275" w:type="dxa"/>
             <w:gridSpan w:val="3"/>
-          </w:tcPr>
-          <w:p>
-            <w:pPr>
-              <w:pStyle w:val="TableParagraph"/>
-              <w:spacing w:line="263" w:lineRule="exact"/>
-              <w:jc w:val="center"/>
-              <w:rPr>
-                <w:sz w:val="24"/>
-                <w:szCs w:val="24"/>
-              </w:rPr>
-            </w:pPr>
-            <w:r>
-              <w:rPr>
-                <w:sz w:val="14"/>
-              </w:rPr>
-              <w:t>{RTE</w:t>
-            </w:r>
-            <w:r>
-              <w:rPr>
-                <w:sz w:val="14"/>
-              </w:rPr>
-              <w:t>P</w:t>
-            </w:r>
-            <w:r>
-              <w:rPr>
-                <w:sz w:val="14"/>
-              </w:rPr>
-              <w:t>}</w:t>
+            <w:vAlign w:val="center"/>
+          </w:tcPr>
+          <w:p>
+            <w:pPr>
+              <w:pStyle w:val="TableParagraph"/>
+              <w:ind w:right="25"/>
+              <w:jc w:val="center"/>
+              <w:rPr>
+                <w:sz w:val="14"/>
+              </w:rPr>
+            </w:pPr>
+            <w:r>
+              <w:rPr>
+                <w:sz w:val="14"/>
+              </w:rPr>
+              <w:t>{RTEP}</w:t>
             </w:r>
           </w:p>
         </w:tc>
       </w:tr>
       <w:tr>
         <w:trPr>
-          <w:gridAfter w:val="26"/>
+          <w:gridAfter w:val="27"/>
           <w:wAfter w:w="8363" w:type="dxa"/>
-          <w:trHeight w:val="337"/>
+          <w:jc w:val="center"/>
         </w:trPr>
         <w:tc>
           <w:tcPr>
@@ -4928,12 +5001,12 @@
       </w:tr>
       <w:tr>
         <w:trPr>
-          <w:trHeight w:val="352"/>
+          <w:jc w:val="center"/>
         </w:trPr>
         <w:tc>
           <w:tcPr>
             <w:tcW w:w="11332" w:type="dxa"/>
-            <w:gridSpan w:val="31"/>
+            <w:gridSpan w:val="32"/>
             <w:tcBorders>
               <w:left w:val="single" w:sz="6" w:space="0" w:color="0000D0"/>
               <w:right w:val="single" w:sz="6" w:space="0" w:color="0000D0"/>
@@ -5620,6 +5693,7 @@
   <w:style w:type="character" w:default="1" w:styleId="Fontepargpadro">
     <w:name w:val="Default Paragraph Font"/>
     <w:uiPriority w:val="1"/>
+    <w:semiHidden/>
     <w:unhideWhenUsed/>
   </w:style>
   <w:style w:type="table" w:default="1" w:styleId="Tabelanormal">

</xml_diff>